<commit_message>
Materialize Prompt Action UI reference assets and DOCX
</commit_message>
<xml_diff>
--- a/docs/UI_REFERENCE_PACKAGE_V1/materialized/Aturan-Resmi-Versioning-Prompt-Action-V1.docx
+++ b/docs/UI_REFERENCE_PACKAGE_V1/materialized/Aturan-Resmi-Versioning-Prompt-Action-V1.docx
@@ -122,7 +122,12 @@
     </w:p>
     <w:p>
       <w:r>
-        <w:t>Semua isi awal Prompt Action diambil dari baseline legacy ini, lalu dinormalkan menjadi:</w:t>
+        <w:t>Baseline System V1 memakai tujuh Prompt yang tetap identik dengan legacy V22.5.1. Prompt 3 memakai rilis resmi legacy v22.5.2 yang telah diselesaikan sebelum normalisasi System V1. Rilis Prompt 3 tersebut dinormalkan sebagai Prompt 3 V1 R1, bukan sebagai R2/S002.</w:t>
+      </w:r>
+    </w:p>
+    <w:p>
+      <w:r>
+        <w:t>Seluruh baseline dinormalkan menjadi:</w:t>
       </w:r>
     </w:p>
     <w:p>

</xml_diff>